<commit_message>
feat: Integrated React frontend SPA, unified prompt rules, and decoupled docx exporters
</commit_message>
<xml_diff>
--- a/reference-docs/GFPI-F-135 LG sample.docx
+++ b/reference-docs/GFPI-F-135 LG sample.docx
@@ -420,7 +420,7 @@
         </w:rPr>
       </w:pPr>
       <w:r>
-        <w:pict w14:anchorId="4B4C45F2">
+        <w:pict w14:anchorId="4BCF18D5">
           <v:rect id="Horizontal Line 1" o:spid="_x0000_s2052" alt="" style="width:481.95pt;height:1.1pt;visibility:visible;mso-wrap-style:square;mso-width-percent:0;mso-height-percent:0;mso-left-percent:-10001;mso-top-percent:-10001;mso-position-horizontal:absolute;mso-position-horizontal-relative:char;mso-position-vertical:absolute;mso-position-vertical-relative:line;mso-width-percent:0;mso-height-percent:0;mso-left-percent:-10001;mso-top-percent:-10001;v-text-anchor:top" filled="f">
             <o:lock v:ext="edit" rotation="t" aspectratio="t" verticies="t" text="t" shapetype="t"/>
             <w10:anchorlock/>
@@ -469,7 +469,7 @@
         </w:rPr>
       </w:pPr>
       <w:r>
-        <w:pict w14:anchorId="640F2B1A">
+        <w:pict w14:anchorId="01B10526">
           <v:rect id="Horizontal Line 2" o:spid="_x0000_s2051" alt="" style="width:481.95pt;height:1.1pt;visibility:visible;mso-wrap-style:square;mso-width-percent:0;mso-height-percent:0;mso-left-percent:-10001;mso-top-percent:-10001;mso-position-horizontal:absolute;mso-position-horizontal-relative:char;mso-position-vertical:absolute;mso-position-vertical-relative:line;mso-width-percent:0;mso-height-percent:0;mso-left-percent:-10001;mso-top-percent:-10001;v-text-anchor:top" filled="f">
             <o:lock v:ext="edit" rotation="t" aspectratio="t" verticies="t" text="t" shapetype="t"/>
             <w10:anchorlock/>
@@ -632,7 +632,7 @@
         </w:rPr>
       </w:pPr>
       <w:r>
-        <w:pict w14:anchorId="7C6C5BA9">
+        <w:pict w14:anchorId="47E35610">
           <v:rect id="Horizontal Line 3" o:spid="_x0000_s2050" alt="" style="width:481.95pt;height:1.1pt;visibility:visible;mso-wrap-style:square;mso-width-percent:0;mso-height-percent:0;mso-left-percent:-10001;mso-top-percent:-10001;mso-position-horizontal:absolute;mso-position-horizontal-relative:char;mso-position-vertical:absolute;mso-position-vertical-relative:line;mso-width-percent:0;mso-height-percent:0;mso-left-percent:-10001;mso-top-percent:-10001;v-text-anchor:top" filled="f">
             <o:lock v:ext="edit" rotation="t" aspectratio="t" verticies="t" text="t" shapetype="t"/>
             <w10:anchorlock/>
@@ -3792,7 +3792,7 @@
       <w:rPr>
         <w:noProof/>
       </w:rPr>
-      <w:pict w14:anchorId="03C06A7F">
+      <w:pict w14:anchorId="64417DDC">
         <v:shapetype id="_x0000_t136" coordsize="21600,21600" o:spt="136" adj="10800" path="m@7,l@8,m@5,21600l@6,21600e">
           <v:formulas>
             <v:f eqn="sum #0 0 10800"/>
@@ -3930,7 +3930,7 @@
       <w:rPr>
         <w:noProof/>
       </w:rPr>
-      <w:pict w14:anchorId="245B8C4C">
+      <w:pict w14:anchorId="77621EA7">
         <v:shapetype id="_x0000_t136" coordsize="21600,21600" o:spt="136" adj="10800" path="m@7,l@8,m@5,21600l@6,21600e">
           <v:formulas>
             <v:f eqn="sum #0 0 10800"/>
@@ -12428,19 +12428,6 @@
 </file>
 
 <file path=customXml/item2.xml><?xml version="1.0" encoding="utf-8"?>
-<?mso-contentType ?>
-<FormTemplates xmlns="http://schemas.microsoft.com/sharepoint/v3/contenttype/forms">
-  <Display>DocumentLibraryForm</Display>
-  <Edit>DocumentLibraryForm</Edit>
-  <New>DocumentLibraryForm</New>
-</FormTemplates>
-</file>
-
-<file path=customXml/item3.xml><?xml version="1.0" encoding="utf-8"?>
-<b:Sources xmlns:b="http://schemas.openxmlformats.org/officeDocument/2006/bibliography" xmlns="http://schemas.openxmlformats.org/officeDocument/2006/bibliography" SelectedStyle="/APA.XSL" StyleName="APA"/>
-</file>
-
-<file path=customXml/item4.xml><?xml version="1.0" encoding="utf-8"?>
 <p:properties xmlns:p="http://schemas.microsoft.com/office/2006/metadata/properties" xmlns:xsi="http://www.w3.org/2001/XMLSchema-instance" xmlns:pc="http://schemas.microsoft.com/office/infopath/2007/PartnerControls">
   <documentManagement>
     <lcf76f155ced4ddcb4097134ff3c332f xmlns="932546ec-9fd3-4385-85aa-a79281ebb4c5">
@@ -12449,6 +12436,19 @@
     <TaxCatchAll xmlns="3b6d2153-ea30-4986-ad45-11d5a60cf126" xsi:nil="true"/>
   </documentManagement>
 </p:properties>
+</file>
+
+<file path=customXml/item3.xml><?xml version="1.0" encoding="utf-8"?>
+<b:Sources xmlns:b="http://schemas.openxmlformats.org/officeDocument/2006/bibliography" xmlns="http://schemas.openxmlformats.org/officeDocument/2006/bibliography" SelectedStyle="/APA.XSL" StyleName="APA"/>
+</file>
+
+<file path=customXml/item4.xml><?xml version="1.0" encoding="utf-8"?>
+<?mso-contentType ?>
+<FormTemplates xmlns="http://schemas.microsoft.com/sharepoint/v3/contenttype/forms">
+  <Display>DocumentLibraryForm</Display>
+  <Edit>DocumentLibraryForm</Edit>
+  <New>DocumentLibraryForm</New>
+</FormTemplates>
 </file>
 
 <file path=customXml/itemProps1.xml><?xml version="1.0" encoding="utf-8"?>
@@ -12471,9 +12471,12 @@
 </file>
 
 <file path=customXml/itemProps2.xml><?xml version="1.0" encoding="utf-8"?>
-<ds:datastoreItem xmlns:ds="http://schemas.openxmlformats.org/officeDocument/2006/customXml" ds:itemID="{3F9D943A-8F73-4333-9169-A981417CD6FA}">
+<ds:datastoreItem xmlns:ds="http://schemas.openxmlformats.org/officeDocument/2006/customXml" ds:itemID="{148CFCA9-C04F-4472-9ACE-2C2B0713CCB5}">
   <ds:schemaRefs>
-    <ds:schemaRef ds:uri="http://schemas.microsoft.com/sharepoint/v3/contenttype/forms"/>
+    <ds:schemaRef ds:uri="http://schemas.microsoft.com/office/2006/metadata/properties"/>
+    <ds:schemaRef ds:uri="http://schemas.microsoft.com/office/infopath/2007/PartnerControls"/>
+    <ds:schemaRef ds:uri="932546ec-9fd3-4385-85aa-a79281ebb4c5"/>
+    <ds:schemaRef ds:uri="3b6d2153-ea30-4986-ad45-11d5a60cf126"/>
   </ds:schemaRefs>
 </ds:datastoreItem>
 </file>
@@ -12487,12 +12490,9 @@
 </file>
 
 <file path=customXml/itemProps4.xml><?xml version="1.0" encoding="utf-8"?>
-<ds:datastoreItem xmlns:ds="http://schemas.openxmlformats.org/officeDocument/2006/customXml" ds:itemID="{148CFCA9-C04F-4472-9ACE-2C2B0713CCB5}">
+<ds:datastoreItem xmlns:ds="http://schemas.openxmlformats.org/officeDocument/2006/customXml" ds:itemID="{3F9D943A-8F73-4333-9169-A981417CD6FA}">
   <ds:schemaRefs>
-    <ds:schemaRef ds:uri="http://schemas.microsoft.com/office/2006/metadata/properties"/>
-    <ds:schemaRef ds:uri="http://schemas.microsoft.com/office/infopath/2007/PartnerControls"/>
-    <ds:schemaRef ds:uri="932546ec-9fd3-4385-85aa-a79281ebb4c5"/>
-    <ds:schemaRef ds:uri="3b6d2153-ea30-4986-ad45-11d5a60cf126"/>
+    <ds:schemaRef ds:uri="http://schemas.microsoft.com/sharepoint/v3/contenttype/forms"/>
   </ds:schemaRefs>
 </ds:datastoreItem>
 </file>
</xml_diff>